<commit_message>
Fix what CI and the publication checks found
- Bench task 12: its check runs on Node.js 22 in a path with non-ASCII letters (no fs.cpSync).
- Tool time is measured from when the agent reported a tool's start and end, not from when YAV handled the reports.
- A copy installed with --no-register is not offered installation; uninstall --remove-data without an
  installation asks nothing; Control+C stops an installation started from the offer.
- Test summary counts skipped tests as not run; the workflows print the Node.js version; the release
  text says why tests did not run on the runner.
- README: download, SmartScreen, prerequisites; the license permits viewing and forking on GitHub;
  the repository settings chosen on 2026-10-07 are recorded.
- Re-verified: 2637 of 2637 tests; 17 of 17 new mutations noticed; package checks 29 of 29 and 37 of 37
  in Windows Sandbox.

Co-Authored-By: Claude Opus 5.5 <noreply@anthropic.com>
</commit_message>
<xml_diff>
--- a/docs/YAV Shell - Documentation and User Guide.docx
+++ b/docs/YAV Shell - Documentation and User Guide.docx
@@ -145,7 +145,7 @@
     </w:p>
     <w:p>
       <w:pPr>
-        <w:spacing w:before="1400"/>
+        <w:spacing w:before="700"/>
       </w:pPr>
     </w:p>
     <w:p>
@@ -166,7 +166,7 @@
         <w:t xml:space="preserve">Status  </w:t>
       </w:r>
       <w:r>
-        <w:t xml:space="preserve">Version 0.2.0 is not code-signed: Windows SmartScreen may warn when a downloaded </w:t>
+        <w:t xml:space="preserve">Version 0.2.0 is not code-signed: Windows SmartScreen may stop a downloaded </w:t>
       </w:r>
       <w:r>
         <w:rPr>
@@ -178,10 +178,34 @@
         <w:t>yav.exe</w:t>
       </w:r>
       <w:r>
-        <w:t xml:space="preserve"> is started for the first time, and where Smart App Control is on, Windows does not start it at all. The Codex app-server interface it uses is labelled experimental by OpenAI. YAV was tested with scripted agents. With real models it has made two runs of one small task, with versions 0.1.0 and 0.1.1; version 0.2.0, which changes how YAV is installed and how the first request is set up, has made none. Its installation was verified with the automated tests and the checks of the package, its guided first reques</w:t>
-      </w:r>
-      <w:r>
-        <w:t>t only with the automated tests, against a scripted stand-in for the agents. Read the section “What was verified” before relying on it.</w:t>
+        <w:t xml:space="preserve"> the first time it is started (section 2.6 says how to go on), and where Smart App Control is on, Windows does not start it at all. The Codex app-server interface it uses is labelled experimental by OpenAI. YAV was tested with scripted agents. With real models it has made two runs of one small task, with versions 0.1.0 and 0.1.1; version 0.2.0, which changes how YAV is installed and how the first request is set up, has made none. Its installation was verified with the automated tests and the checks of the p</w:t>
+      </w:r>
+      <w:r>
+        <w:t xml:space="preserve">ackage, made with a </w:t>
+      </w:r>
+      <w:r>
+        <w:rPr>
+          <w:rFonts w:ascii="Consolas" w:eastAsia="Consolas" w:hAnsi="Consolas" w:cs="Consolas"/>
+          <w:sz w:val="20"/>
+          <w:szCs w:val="20"/>
+          <w:shd w:val="clear" w:color="auto" w:fill="E8ECF1"/>
+        </w:rPr>
+        <w:t>yav.exe</w:t>
+      </w:r>
+      <w:r>
+        <w:t xml:space="preserve"> built on the development PC; its guided first request only with the automated tests, against a scripted stand-in for the agents. The </w:t>
+      </w:r>
+      <w:r>
+        <w:rPr>
+          <w:rFonts w:ascii="Consolas" w:eastAsia="Consolas" w:hAnsi="Consolas" w:cs="Consolas"/>
+          <w:sz w:val="20"/>
+          <w:szCs w:val="20"/>
+          <w:shd w:val="clear" w:color="auto" w:fill="E8ECF1"/>
+        </w:rPr>
+        <w:t>yav.exe</w:t>
+      </w:r>
+      <w:r>
+        <w:t xml:space="preserve"> of a release is built again by the release workflow (section 12.2). Read the section “What was verified” before relying on it.</w:t>
       </w:r>
     </w:p>
     <w:p>
@@ -211,7 +235,7 @@
           <w:szCs w:val="22"/>
         </w:rPr>
         <w:alias w:val="Contents"/>
-        <w:id w:val="-859736831"/>
+        <w:id w:val="-619611697"/>
       </w:sdtPr>
       <w:sdtEndPr/>
       <w:sdtContent>
@@ -240,7 +264,7 @@
           <w:r>
             <w:fldChar w:fldCharType="separate"/>
           </w:r>
-          <w:hyperlink w:anchor="_Toc242301952" w:history="1">
+          <w:hyperlink w:anchor="_Toc242309360" w:history="1">
             <w:r>
               <w:rPr>
                 <w:rStyle w:val="Hyperlink"/>
@@ -264,7 +288,7 @@
               <w:rPr>
                 <w:noProof/>
               </w:rPr>
-              <w:instrText xml:space="preserve"> PAGEREF _Toc242301952 \h </w:instrText>
+              <w:instrText xml:space="preserve"> PAGEREF _Toc242309360 \h </w:instrText>
             </w:r>
             <w:r>
               <w:rPr>
@@ -307,7 +331,7 @@
               <w14:ligatures w14:val="standardContextual"/>
             </w:rPr>
           </w:pPr>
-          <w:hyperlink w:anchor="_Toc242301953" w:history="1">
+          <w:hyperlink w:anchor="_Toc242309361" w:history="1">
             <w:r>
               <w:rPr>
                 <w:rStyle w:val="Hyperlink"/>
@@ -331,7 +355,7 @@
               <w:rPr>
                 <w:noProof/>
               </w:rPr>
-              <w:instrText xml:space="preserve"> PAGEREF _Toc242301953 \h </w:instrText>
+              <w:instrText xml:space="preserve"> PAGEREF _Toc242309361 \h </w:instrText>
             </w:r>
             <w:r>
               <w:rPr>
@@ -374,7 +398,7 @@
               <w14:ligatures w14:val="standardContextual"/>
             </w:rPr>
           </w:pPr>
-          <w:hyperlink w:anchor="_Toc242301954" w:history="1">
+          <w:hyperlink w:anchor="_Toc242309362" w:history="1">
             <w:r>
               <w:rPr>
                 <w:rStyle w:val="Hyperlink"/>
@@ -398,7 +422,7 @@
               <w:rPr>
                 <w:noProof/>
               </w:rPr>
-              <w:instrText xml:space="preserve"> PAGEREF _Toc242301954 \h </w:instrText>
+              <w:instrText xml:space="preserve"> PAGEREF _Toc242309362 \h </w:instrText>
             </w:r>
             <w:r>
               <w:rPr>
@@ -441,7 +465,7 @@
               <w14:ligatures w14:val="standardContextual"/>
             </w:rPr>
           </w:pPr>
-          <w:hyperlink w:anchor="_Toc242301955" w:history="1">
+          <w:hyperlink w:anchor="_Toc242309363" w:history="1">
             <w:r>
               <w:rPr>
                 <w:rStyle w:val="Hyperlink"/>
@@ -465,7 +489,7 @@
               <w:rPr>
                 <w:noProof/>
               </w:rPr>
-              <w:instrText xml:space="preserve"> PAGEREF _Toc242301955 \h </w:instrText>
+              <w:instrText xml:space="preserve"> PAGEREF _Toc242309363 \h </w:instrText>
             </w:r>
             <w:r>
               <w:rPr>
@@ -508,7 +532,7 @@
               <w14:ligatures w14:val="standardContextual"/>
             </w:rPr>
           </w:pPr>
-          <w:hyperlink w:anchor="_Toc242301956" w:history="1">
+          <w:hyperlink w:anchor="_Toc242309364" w:history="1">
             <w:r>
               <w:rPr>
                 <w:rStyle w:val="Hyperlink"/>
@@ -532,7 +556,7 @@
               <w:rPr>
                 <w:noProof/>
               </w:rPr>
-              <w:instrText xml:space="preserve"> PAGEREF _Toc242301956 \h </w:instrText>
+              <w:instrText xml:space="preserve"> PAGEREF _Toc242309364 \h </w:instrText>
             </w:r>
             <w:r>
               <w:rPr>
@@ -575,7 +599,7 @@
               <w14:ligatures w14:val="standardContextual"/>
             </w:rPr>
           </w:pPr>
-          <w:hyperlink w:anchor="_Toc242301957" w:history="1">
+          <w:hyperlink w:anchor="_Toc242309365" w:history="1">
             <w:r>
               <w:rPr>
                 <w:rStyle w:val="Hyperlink"/>
@@ -599,7 +623,7 @@
               <w:rPr>
                 <w:noProof/>
               </w:rPr>
-              <w:instrText xml:space="preserve"> PAGEREF _Toc242301957 \h </w:instrText>
+              <w:instrText xml:space="preserve"> PAGEREF _Toc242309365 \h </w:instrText>
             </w:r>
             <w:r>
               <w:rPr>
@@ -642,7 +666,7 @@
               <w14:ligatures w14:val="standardContextual"/>
             </w:rPr>
           </w:pPr>
-          <w:hyperlink w:anchor="_Toc242301958" w:history="1">
+          <w:hyperlink w:anchor="_Toc242309366" w:history="1">
             <w:r>
               <w:rPr>
                 <w:rStyle w:val="Hyperlink"/>
@@ -666,7 +690,7 @@
               <w:rPr>
                 <w:noProof/>
               </w:rPr>
-              <w:instrText xml:space="preserve"> PAGEREF _Toc242301958 \h </w:instrText>
+              <w:instrText xml:space="preserve"> PAGEREF _Toc242309366 \h </w:instrText>
             </w:r>
             <w:r>
               <w:rPr>
@@ -709,7 +733,7 @@
               <w14:ligatures w14:val="standardContextual"/>
             </w:rPr>
           </w:pPr>
-          <w:hyperlink w:anchor="_Toc242301959" w:history="1">
+          <w:hyperlink w:anchor="_Toc242309367" w:history="1">
             <w:r>
               <w:rPr>
                 <w:rStyle w:val="Hyperlink"/>
@@ -733,7 +757,7 @@
               <w:rPr>
                 <w:noProof/>
               </w:rPr>
-              <w:instrText xml:space="preserve"> PAGEREF _Toc242301959 \h </w:instrText>
+              <w:instrText xml:space="preserve"> PAGEREF _Toc242309367 \h </w:instrText>
             </w:r>
             <w:r>
               <w:rPr>
@@ -776,7 +800,7 @@
               <w14:ligatures w14:val="standardContextual"/>
             </w:rPr>
           </w:pPr>
-          <w:hyperlink w:anchor="_Toc242301960" w:history="1">
+          <w:hyperlink w:anchor="_Toc242309368" w:history="1">
             <w:r>
               <w:rPr>
                 <w:rStyle w:val="Hyperlink"/>
@@ -800,7 +824,7 @@
               <w:rPr>
                 <w:noProof/>
               </w:rPr>
-              <w:instrText xml:space="preserve"> PAGEREF _Toc242301960 \h </w:instrText>
+              <w:instrText xml:space="preserve"> PAGEREF _Toc242309368 \h </w:instrText>
             </w:r>
             <w:r>
               <w:rPr>
@@ -817,7 +841,7 @@
               <w:rPr>
                 <w:noProof/>
               </w:rPr>
-              <w:t>6</w:t>
+              <w:t>7</w:t>
             </w:r>
             <w:r>
               <w:rPr>
@@ -843,7 +867,7 @@
               <w14:ligatures w14:val="standardContextual"/>
             </w:rPr>
           </w:pPr>
-          <w:hyperlink w:anchor="_Toc242301961" w:history="1">
+          <w:hyperlink w:anchor="_Toc242309369" w:history="1">
             <w:r>
               <w:rPr>
                 <w:rStyle w:val="Hyperlink"/>
@@ -867,7 +891,7 @@
               <w:rPr>
                 <w:noProof/>
               </w:rPr>
-              <w:instrText xml:space="preserve"> PAGEREF _Toc242301961 \h </w:instrText>
+              <w:instrText xml:space="preserve"> PAGEREF _Toc242309369 \h </w:instrText>
             </w:r>
             <w:r>
               <w:rPr>
@@ -910,7 +934,7 @@
               <w14:ligatures w14:val="standardContextual"/>
             </w:rPr>
           </w:pPr>
-          <w:hyperlink w:anchor="_Toc242301962" w:history="1">
+          <w:hyperlink w:anchor="_Toc242309370" w:history="1">
             <w:r>
               <w:rPr>
                 <w:rStyle w:val="Hyperlink"/>
@@ -934,7 +958,7 @@
               <w:rPr>
                 <w:noProof/>
               </w:rPr>
-              <w:instrText xml:space="preserve"> PAGEREF _Toc242301962 \h </w:instrText>
+              <w:instrText xml:space="preserve"> PAGEREF _Toc242309370 \h </w:instrText>
             </w:r>
             <w:r>
               <w:rPr>
@@ -951,7 +975,7 @@
               <w:rPr>
                 <w:noProof/>
               </w:rPr>
-              <w:t>7</w:t>
+              <w:t>8</w:t>
             </w:r>
             <w:r>
               <w:rPr>
@@ -977,7 +1001,7 @@
               <w14:ligatures w14:val="standardContextual"/>
             </w:rPr>
           </w:pPr>
-          <w:hyperlink w:anchor="_Toc242301963" w:history="1">
+          <w:hyperlink w:anchor="_Toc242309371" w:history="1">
             <w:r>
               <w:rPr>
                 <w:rStyle w:val="Hyperlink"/>
@@ -1001,7 +1025,7 @@
               <w:rPr>
                 <w:noProof/>
               </w:rPr>
-              <w:instrText xml:space="preserve"> PAGEREF _Toc242301963 \h </w:instrText>
+              <w:instrText xml:space="preserve"> PAGEREF _Toc242309371 \h </w:instrText>
             </w:r>
             <w:r>
               <w:rPr>
@@ -1044,7 +1068,7 @@
               <w14:ligatures w14:val="standardContextual"/>
             </w:rPr>
           </w:pPr>
-          <w:hyperlink w:anchor="_Toc242301964" w:history="1">
+          <w:hyperlink w:anchor="_Toc242309372" w:history="1">
             <w:r>
               <w:rPr>
                 <w:rStyle w:val="Hyperlink"/>
@@ -1068,7 +1092,7 @@
               <w:rPr>
                 <w:noProof/>
               </w:rPr>
-              <w:instrText xml:space="preserve"> PAGEREF _Toc242301964 \h </w:instrText>
+              <w:instrText xml:space="preserve"> PAGEREF _Toc242309372 \h </w:instrText>
             </w:r>
             <w:r>
               <w:rPr>
@@ -1111,7 +1135,7 @@
               <w14:ligatures w14:val="standardContextual"/>
             </w:rPr>
           </w:pPr>
-          <w:hyperlink w:anchor="_Toc242301965" w:history="1">
+          <w:hyperlink w:anchor="_Toc242309373" w:history="1">
             <w:r>
               <w:rPr>
                 <w:rStyle w:val="Hyperlink"/>
@@ -1135,7 +1159,7 @@
               <w:rPr>
                 <w:noProof/>
               </w:rPr>
-              <w:instrText xml:space="preserve"> PAGEREF _Toc242301965 \h </w:instrText>
+              <w:instrText xml:space="preserve"> PAGEREF _Toc242309373 \h </w:instrText>
             </w:r>
             <w:r>
               <w:rPr>
@@ -1178,7 +1202,7 @@
               <w14:ligatures w14:val="standardContextual"/>
             </w:rPr>
           </w:pPr>
-          <w:hyperlink w:anchor="_Toc242301966" w:history="1">
+          <w:hyperlink w:anchor="_Toc242309374" w:history="1">
             <w:r>
               <w:rPr>
                 <w:rStyle w:val="Hyperlink"/>
@@ -1202,7 +1226,7 @@
               <w:rPr>
                 <w:noProof/>
               </w:rPr>
-              <w:instrText xml:space="preserve"> PAGEREF _Toc242301966 \h </w:instrText>
+              <w:instrText xml:space="preserve"> PAGEREF _Toc242309374 \h </w:instrText>
             </w:r>
             <w:r>
               <w:rPr>
@@ -1245,7 +1269,7 @@
               <w14:ligatures w14:val="standardContextual"/>
             </w:rPr>
           </w:pPr>
-          <w:hyperlink w:anchor="_Toc242301967" w:history="1">
+          <w:hyperlink w:anchor="_Toc242309375" w:history="1">
             <w:r>
               <w:rPr>
                 <w:rStyle w:val="Hyperlink"/>
@@ -1269,7 +1293,7 @@
               <w:rPr>
                 <w:noProof/>
               </w:rPr>
-              <w:instrText xml:space="preserve"> PAGEREF _Toc242301967 \h </w:instrText>
+              <w:instrText xml:space="preserve"> PAGEREF _Toc242309375 \h </w:instrText>
             </w:r>
             <w:r>
               <w:rPr>
@@ -1312,7 +1336,7 @@
               <w14:ligatures w14:val="standardContextual"/>
             </w:rPr>
           </w:pPr>
-          <w:hyperlink w:anchor="_Toc242301968" w:history="1">
+          <w:hyperlink w:anchor="_Toc242309376" w:history="1">
             <w:r>
               <w:rPr>
                 <w:rStyle w:val="Hyperlink"/>
@@ -1336,7 +1360,7 @@
               <w:rPr>
                 <w:noProof/>
               </w:rPr>
-              <w:instrText xml:space="preserve"> PAGEREF _Toc242301968 \h </w:instrText>
+              <w:instrText xml:space="preserve"> PAGEREF _Toc242309376 \h </w:instrText>
             </w:r>
             <w:r>
               <w:rPr>
@@ -1379,7 +1403,7 @@
               <w14:ligatures w14:val="standardContextual"/>
             </w:rPr>
           </w:pPr>
-          <w:hyperlink w:anchor="_Toc242301969" w:history="1">
+          <w:hyperlink w:anchor="_Toc242309377" w:history="1">
             <w:r>
               <w:rPr>
                 <w:rStyle w:val="Hyperlink"/>
@@ -1403,7 +1427,7 @@
               <w:rPr>
                 <w:noProof/>
               </w:rPr>
-              <w:instrText xml:space="preserve"> PAGEREF _Toc242301969 \h </w:instrText>
+              <w:instrText xml:space="preserve"> PAGEREF _Toc242309377 \h </w:instrText>
             </w:r>
             <w:r>
               <w:rPr>
@@ -1446,7 +1470,7 @@
               <w14:ligatures w14:val="standardContextual"/>
             </w:rPr>
           </w:pPr>
-          <w:hyperlink w:anchor="_Toc242301970" w:history="1">
+          <w:hyperlink w:anchor="_Toc242309378" w:history="1">
             <w:r>
               <w:rPr>
                 <w:rStyle w:val="Hyperlink"/>
@@ -1470,7 +1494,7 @@
               <w:rPr>
                 <w:noProof/>
               </w:rPr>
-              <w:instrText xml:space="preserve"> PAGEREF _Toc242301970 \h </w:instrText>
+              <w:instrText xml:space="preserve"> PAGEREF _Toc242309378 \h </w:instrText>
             </w:r>
             <w:r>
               <w:rPr>
@@ -1513,7 +1537,7 @@
               <w14:ligatures w14:val="standardContextual"/>
             </w:rPr>
           </w:pPr>
-          <w:hyperlink w:anchor="_Toc242301971" w:history="1">
+          <w:hyperlink w:anchor="_Toc242309379" w:history="1">
             <w:r>
               <w:rPr>
                 <w:rStyle w:val="Hyperlink"/>
@@ -1537,7 +1561,7 @@
               <w:rPr>
                 <w:noProof/>
               </w:rPr>
-              <w:instrText xml:space="preserve"> PAGEREF _Toc242301971 \h </w:instrText>
+              <w:instrText xml:space="preserve"> PAGEREF _Toc242309379 \h </w:instrText>
             </w:r>
             <w:r>
               <w:rPr>
@@ -1580,7 +1604,7 @@
               <w14:ligatures w14:val="standardContextual"/>
             </w:rPr>
           </w:pPr>
-          <w:hyperlink w:anchor="_Toc242301972" w:history="1">
+          <w:hyperlink w:anchor="_Toc242309380" w:history="1">
             <w:r>
               <w:rPr>
                 <w:rStyle w:val="Hyperlink"/>
@@ -1604,7 +1628,7 @@
               <w:rPr>
                 <w:noProof/>
               </w:rPr>
-              <w:instrText xml:space="preserve"> PAGEREF _Toc242301972 \h </w:instrText>
+              <w:instrText xml:space="preserve"> PAGEREF _Toc242309380 \h </w:instrText>
             </w:r>
             <w:r>
               <w:rPr>
@@ -1647,7 +1671,7 @@
               <w14:ligatures w14:val="standardContextual"/>
             </w:rPr>
           </w:pPr>
-          <w:hyperlink w:anchor="_Toc242301973" w:history="1">
+          <w:hyperlink w:anchor="_Toc242309381" w:history="1">
             <w:r>
               <w:rPr>
                 <w:rStyle w:val="Hyperlink"/>
@@ -1671,7 +1695,7 @@
               <w:rPr>
                 <w:noProof/>
               </w:rPr>
-              <w:instrText xml:space="preserve"> PAGEREF _Toc242301973 \h </w:instrText>
+              <w:instrText xml:space="preserve"> PAGEREF _Toc242309381 \h </w:instrText>
             </w:r>
             <w:r>
               <w:rPr>
@@ -1714,7 +1738,7 @@
               <w14:ligatures w14:val="standardContextual"/>
             </w:rPr>
           </w:pPr>
-          <w:hyperlink w:anchor="_Toc242301974" w:history="1">
+          <w:hyperlink w:anchor="_Toc242309382" w:history="1">
             <w:r>
               <w:rPr>
                 <w:rStyle w:val="Hyperlink"/>
@@ -1738,7 +1762,7 @@
               <w:rPr>
                 <w:noProof/>
               </w:rPr>
-              <w:instrText xml:space="preserve"> PAGEREF _Toc242301974 \h </w:instrText>
+              <w:instrText xml:space="preserve"> PAGEREF _Toc242309382 \h </w:instrText>
             </w:r>
             <w:r>
               <w:rPr>
@@ -1781,7 +1805,7 @@
               <w14:ligatures w14:val="standardContextual"/>
             </w:rPr>
           </w:pPr>
-          <w:hyperlink w:anchor="_Toc242301975" w:history="1">
+          <w:hyperlink w:anchor="_Toc242309383" w:history="1">
             <w:r>
               <w:rPr>
                 <w:rStyle w:val="Hyperlink"/>
@@ -1805,7 +1829,7 @@
               <w:rPr>
                 <w:noProof/>
               </w:rPr>
-              <w:instrText xml:space="preserve"> PAGEREF _Toc242301975 \h </w:instrText>
+              <w:instrText xml:space="preserve"> PAGEREF _Toc242309383 \h </w:instrText>
             </w:r>
             <w:r>
               <w:rPr>
@@ -1848,7 +1872,7 @@
               <w14:ligatures w14:val="standardContextual"/>
             </w:rPr>
           </w:pPr>
-          <w:hyperlink w:anchor="_Toc242301976" w:history="1">
+          <w:hyperlink w:anchor="_Toc242309384" w:history="1">
             <w:r>
               <w:rPr>
                 <w:rStyle w:val="Hyperlink"/>
@@ -1872,7 +1896,7 @@
               <w:rPr>
                 <w:noProof/>
               </w:rPr>
-              <w:instrText xml:space="preserve"> PAGEREF _Toc242301976 \h </w:instrText>
+              <w:instrText xml:space="preserve"> PAGEREF _Toc242309384 \h </w:instrText>
             </w:r>
             <w:r>
               <w:rPr>
@@ -1915,7 +1939,7 @@
               <w14:ligatures w14:val="standardContextual"/>
             </w:rPr>
           </w:pPr>
-          <w:hyperlink w:anchor="_Toc242301977" w:history="1">
+          <w:hyperlink w:anchor="_Toc242309385" w:history="1">
             <w:r>
               <w:rPr>
                 <w:rStyle w:val="Hyperlink"/>
@@ -1939,7 +1963,7 @@
               <w:rPr>
                 <w:noProof/>
               </w:rPr>
-              <w:instrText xml:space="preserve"> PAGEREF _Toc242301977 \h </w:instrText>
+              <w:instrText xml:space="preserve"> PAGEREF _Toc242309385 \h </w:instrText>
             </w:r>
             <w:r>
               <w:rPr>
@@ -1982,7 +2006,7 @@
               <w14:ligatures w14:val="standardContextual"/>
             </w:rPr>
           </w:pPr>
-          <w:hyperlink w:anchor="_Toc242301978" w:history="1">
+          <w:hyperlink w:anchor="_Toc242309386" w:history="1">
             <w:r>
               <w:rPr>
                 <w:rStyle w:val="Hyperlink"/>
@@ -2006,7 +2030,7 @@
               <w:rPr>
                 <w:noProof/>
               </w:rPr>
-              <w:instrText xml:space="preserve"> PAGEREF _Toc242301978 \h </w:instrText>
+              <w:instrText xml:space="preserve"> PAGEREF _Toc242309386 \h </w:instrText>
             </w:r>
             <w:r>
               <w:rPr>
@@ -2049,7 +2073,7 @@
               <w14:ligatures w14:val="standardContextual"/>
             </w:rPr>
           </w:pPr>
-          <w:hyperlink w:anchor="_Toc242301979" w:history="1">
+          <w:hyperlink w:anchor="_Toc242309387" w:history="1">
             <w:r>
               <w:rPr>
                 <w:rStyle w:val="Hyperlink"/>
@@ -2073,7 +2097,7 @@
               <w:rPr>
                 <w:noProof/>
               </w:rPr>
-              <w:instrText xml:space="preserve"> PAGEREF _Toc242301979 \h </w:instrText>
+              <w:instrText xml:space="preserve"> PAGEREF _Toc242309387 \h </w:instrText>
             </w:r>
             <w:r>
               <w:rPr>
@@ -2116,7 +2140,7 @@
               <w14:ligatures w14:val="standardContextual"/>
             </w:rPr>
           </w:pPr>
-          <w:hyperlink w:anchor="_Toc242301980" w:history="1">
+          <w:hyperlink w:anchor="_Toc242309388" w:history="1">
             <w:r>
               <w:rPr>
                 <w:rStyle w:val="Hyperlink"/>
@@ -2140,7 +2164,7 @@
               <w:rPr>
                 <w:noProof/>
               </w:rPr>
-              <w:instrText xml:space="preserve"> PAGEREF _Toc242301980 \h </w:instrText>
+              <w:instrText xml:space="preserve"> PAGEREF _Toc242309388 \h </w:instrText>
             </w:r>
             <w:r>
               <w:rPr>
@@ -2183,7 +2207,7 @@
               <w14:ligatures w14:val="standardContextual"/>
             </w:rPr>
           </w:pPr>
-          <w:hyperlink w:anchor="_Toc242301981" w:history="1">
+          <w:hyperlink w:anchor="_Toc242309389" w:history="1">
             <w:r>
               <w:rPr>
                 <w:rStyle w:val="Hyperlink"/>
@@ -2207,7 +2231,7 @@
               <w:rPr>
                 <w:noProof/>
               </w:rPr>
-              <w:instrText xml:space="preserve"> PAGEREF _Toc242301981 \h </w:instrText>
+              <w:instrText xml:space="preserve"> PAGEREF _Toc242309389 \h </w:instrText>
             </w:r>
             <w:r>
               <w:rPr>
@@ -2250,7 +2274,7 @@
               <w14:ligatures w14:val="standardContextual"/>
             </w:rPr>
           </w:pPr>
-          <w:hyperlink w:anchor="_Toc242301982" w:history="1">
+          <w:hyperlink w:anchor="_Toc242309390" w:history="1">
             <w:r>
               <w:rPr>
                 <w:rStyle w:val="Hyperlink"/>
@@ -2274,7 +2298,7 @@
               <w:rPr>
                 <w:noProof/>
               </w:rPr>
-              <w:instrText xml:space="preserve"> PAGEREF _Toc242301982 \h </w:instrText>
+              <w:instrText xml:space="preserve"> PAGEREF _Toc242309390 \h </w:instrText>
             </w:r>
             <w:r>
               <w:rPr>
@@ -2317,7 +2341,7 @@
               <w14:ligatures w14:val="standardContextual"/>
             </w:rPr>
           </w:pPr>
-          <w:hyperlink w:anchor="_Toc242301983" w:history="1">
+          <w:hyperlink w:anchor="_Toc242309391" w:history="1">
             <w:r>
               <w:rPr>
                 <w:rStyle w:val="Hyperlink"/>
@@ -2341,7 +2365,7 @@
               <w:rPr>
                 <w:noProof/>
               </w:rPr>
-              <w:instrText xml:space="preserve"> PAGEREF _Toc242301983 \h </w:instrText>
+              <w:instrText xml:space="preserve"> PAGEREF _Toc242309391 \h </w:instrText>
             </w:r>
             <w:r>
               <w:rPr>
@@ -2384,7 +2408,7 @@
               <w14:ligatures w14:val="standardContextual"/>
             </w:rPr>
           </w:pPr>
-          <w:hyperlink w:anchor="_Toc242301984" w:history="1">
+          <w:hyperlink w:anchor="_Toc242309392" w:history="1">
             <w:r>
               <w:rPr>
                 <w:rStyle w:val="Hyperlink"/>
@@ -2408,7 +2432,7 @@
               <w:rPr>
                 <w:noProof/>
               </w:rPr>
-              <w:instrText xml:space="preserve"> PAGEREF _Toc242301984 \h </w:instrText>
+              <w:instrText xml:space="preserve"> PAGEREF _Toc242309392 \h </w:instrText>
             </w:r>
             <w:r>
               <w:rPr>
@@ -2451,7 +2475,7 @@
               <w14:ligatures w14:val="standardContextual"/>
             </w:rPr>
           </w:pPr>
-          <w:hyperlink w:anchor="_Toc242301985" w:history="1">
+          <w:hyperlink w:anchor="_Toc242309393" w:history="1">
             <w:r>
               <w:rPr>
                 <w:rStyle w:val="Hyperlink"/>
@@ -2475,7 +2499,7 @@
               <w:rPr>
                 <w:noProof/>
               </w:rPr>
-              <w:instrText xml:space="preserve"> PAGEREF _Toc242301985 \h </w:instrText>
+              <w:instrText xml:space="preserve"> PAGEREF _Toc242309393 \h </w:instrText>
             </w:r>
             <w:r>
               <w:rPr>
@@ -2518,7 +2542,7 @@
               <w14:ligatures w14:val="standardContextual"/>
             </w:rPr>
           </w:pPr>
-          <w:hyperlink w:anchor="_Toc242301986" w:history="1">
+          <w:hyperlink w:anchor="_Toc242309394" w:history="1">
             <w:r>
               <w:rPr>
                 <w:rStyle w:val="Hyperlink"/>
@@ -2542,7 +2566,7 @@
               <w:rPr>
                 <w:noProof/>
               </w:rPr>
-              <w:instrText xml:space="preserve"> PAGEREF _Toc242301986 \h </w:instrText>
+              <w:instrText xml:space="preserve"> PAGEREF _Toc242309394 \h </w:instrText>
             </w:r>
             <w:r>
               <w:rPr>
@@ -2585,7 +2609,7 @@
               <w14:ligatures w14:val="standardContextual"/>
             </w:rPr>
           </w:pPr>
-          <w:hyperlink w:anchor="_Toc242301987" w:history="1">
+          <w:hyperlink w:anchor="_Toc242309395" w:history="1">
             <w:r>
               <w:rPr>
                 <w:rStyle w:val="Hyperlink"/>
@@ -2609,7 +2633,7 @@
               <w:rPr>
                 <w:noProof/>
               </w:rPr>
-              <w:instrText xml:space="preserve"> PAGEREF _Toc242301987 \h </w:instrText>
+              <w:instrText xml:space="preserve"> PAGEREF _Toc242309395 \h </w:instrText>
             </w:r>
             <w:r>
               <w:rPr>
@@ -2652,7 +2676,7 @@
               <w14:ligatures w14:val="standardContextual"/>
             </w:rPr>
           </w:pPr>
-          <w:hyperlink w:anchor="_Toc242301988" w:history="1">
+          <w:hyperlink w:anchor="_Toc242309396" w:history="1">
             <w:r>
               <w:rPr>
                 <w:rStyle w:val="Hyperlink"/>
@@ -2676,7 +2700,7 @@
               <w:rPr>
                 <w:noProof/>
               </w:rPr>
-              <w:instrText xml:space="preserve"> PAGEREF _Toc242301988 \h </w:instrText>
+              <w:instrText xml:space="preserve"> PAGEREF _Toc242309396 \h </w:instrText>
             </w:r>
             <w:r>
               <w:rPr>
@@ -2719,7 +2743,7 @@
               <w14:ligatures w14:val="standardContextual"/>
             </w:rPr>
           </w:pPr>
-          <w:hyperlink w:anchor="_Toc242301989" w:history="1">
+          <w:hyperlink w:anchor="_Toc242309397" w:history="1">
             <w:r>
               <w:rPr>
                 <w:rStyle w:val="Hyperlink"/>
@@ -2743,7 +2767,7 @@
               <w:rPr>
                 <w:noProof/>
               </w:rPr>
-              <w:instrText xml:space="preserve"> PAGEREF _Toc242301989 \h </w:instrText>
+              <w:instrText xml:space="preserve"> PAGEREF _Toc242309397 \h </w:instrText>
             </w:r>
             <w:r>
               <w:rPr>
@@ -2786,7 +2810,7 @@
               <w14:ligatures w14:val="standardContextual"/>
             </w:rPr>
           </w:pPr>
-          <w:hyperlink w:anchor="_Toc242301990" w:history="1">
+          <w:hyperlink w:anchor="_Toc242309398" w:history="1">
             <w:r>
               <w:rPr>
                 <w:rStyle w:val="Hyperlink"/>
@@ -2810,7 +2834,7 @@
               <w:rPr>
                 <w:noProof/>
               </w:rPr>
-              <w:instrText xml:space="preserve"> PAGEREF _Toc242301990 \h </w:instrText>
+              <w:instrText xml:space="preserve"> PAGEREF _Toc242309398 \h </w:instrText>
             </w:r>
             <w:r>
               <w:rPr>
@@ -2853,7 +2877,7 @@
               <w14:ligatures w14:val="standardContextual"/>
             </w:rPr>
           </w:pPr>
-          <w:hyperlink w:anchor="_Toc242301991" w:history="1">
+          <w:hyperlink w:anchor="_Toc242309399" w:history="1">
             <w:r>
               <w:rPr>
                 <w:rStyle w:val="Hyperlink"/>
@@ -2877,7 +2901,7 @@
               <w:rPr>
                 <w:noProof/>
               </w:rPr>
-              <w:instrText xml:space="preserve"> PAGEREF _Toc242301991 \h </w:instrText>
+              <w:instrText xml:space="preserve"> PAGEREF _Toc242309399 \h </w:instrText>
             </w:r>
             <w:r>
               <w:rPr>
@@ -2920,7 +2944,7 @@
               <w14:ligatures w14:val="standardContextual"/>
             </w:rPr>
           </w:pPr>
-          <w:hyperlink w:anchor="_Toc242301992" w:history="1">
+          <w:hyperlink w:anchor="_Toc242309400" w:history="1">
             <w:r>
               <w:rPr>
                 <w:rStyle w:val="Hyperlink"/>
@@ -2944,7 +2968,7 @@
               <w:rPr>
                 <w:noProof/>
               </w:rPr>
-              <w:instrText xml:space="preserve"> PAGEREF _Toc242301992 \h </w:instrText>
+              <w:instrText xml:space="preserve"> PAGEREF _Toc242309400 \h </w:instrText>
             </w:r>
             <w:r>
               <w:rPr>
@@ -2987,7 +3011,7 @@
               <w14:ligatures w14:val="standardContextual"/>
             </w:rPr>
           </w:pPr>
-          <w:hyperlink w:anchor="_Toc242301993" w:history="1">
+          <w:hyperlink w:anchor="_Toc242309401" w:history="1">
             <w:r>
               <w:rPr>
                 <w:rStyle w:val="Hyperlink"/>
@@ -3011,7 +3035,7 @@
               <w:rPr>
                 <w:noProof/>
               </w:rPr>
-              <w:instrText xml:space="preserve"> PAGEREF _Toc242301993 \h </w:instrText>
+              <w:instrText xml:space="preserve"> PAGEREF _Toc242309401 \h </w:instrText>
             </w:r>
             <w:r>
               <w:rPr>
@@ -3054,7 +3078,7 @@
               <w14:ligatures w14:val="standardContextual"/>
             </w:rPr>
           </w:pPr>
-          <w:hyperlink w:anchor="_Toc242301994" w:history="1">
+          <w:hyperlink w:anchor="_Toc242309402" w:history="1">
             <w:r>
               <w:rPr>
                 <w:rStyle w:val="Hyperlink"/>
@@ -3078,7 +3102,7 @@
               <w:rPr>
                 <w:noProof/>
               </w:rPr>
-              <w:instrText xml:space="preserve"> PAGEREF _Toc242301994 \h </w:instrText>
+              <w:instrText xml:space="preserve"> PAGEREF _Toc242309402 \h </w:instrText>
             </w:r>
             <w:r>
               <w:rPr>
@@ -3121,7 +3145,7 @@
               <w14:ligatures w14:val="standardContextual"/>
             </w:rPr>
           </w:pPr>
-          <w:hyperlink w:anchor="_Toc242301995" w:history="1">
+          <w:hyperlink w:anchor="_Toc242309403" w:history="1">
             <w:r>
               <w:rPr>
                 <w:rStyle w:val="Hyperlink"/>
@@ -3145,7 +3169,7 @@
               <w:rPr>
                 <w:noProof/>
               </w:rPr>
-              <w:instrText xml:space="preserve"> PAGEREF _Toc242301995 \h </w:instrText>
+              <w:instrText xml:space="preserve"> PAGEREF _Toc242309403 \h </w:instrText>
             </w:r>
             <w:r>
               <w:rPr>
@@ -3188,7 +3212,7 @@
               <w14:ligatures w14:val="standardContextual"/>
             </w:rPr>
           </w:pPr>
-          <w:hyperlink w:anchor="_Toc242301996" w:history="1">
+          <w:hyperlink w:anchor="_Toc242309404" w:history="1">
             <w:r>
               <w:rPr>
                 <w:rStyle w:val="Hyperlink"/>
@@ -3212,7 +3236,7 @@
               <w:rPr>
                 <w:noProof/>
               </w:rPr>
-              <w:instrText xml:space="preserve"> PAGEREF _Toc242301996 \h </w:instrText>
+              <w:instrText xml:space="preserve"> PAGEREF _Toc242309404 \h </w:instrText>
             </w:r>
             <w:r>
               <w:rPr>
@@ -3255,7 +3279,7 @@
               <w14:ligatures w14:val="standardContextual"/>
             </w:rPr>
           </w:pPr>
-          <w:hyperlink w:anchor="_Toc242301997" w:history="1">
+          <w:hyperlink w:anchor="_Toc242309405" w:history="1">
             <w:r>
               <w:rPr>
                 <w:rStyle w:val="Hyperlink"/>
@@ -3279,7 +3303,7 @@
               <w:rPr>
                 <w:noProof/>
               </w:rPr>
-              <w:instrText xml:space="preserve"> PAGEREF _Toc242301997 \h </w:instrText>
+              <w:instrText xml:space="preserve"> PAGEREF _Toc242309405 \h </w:instrText>
             </w:r>
             <w:r>
               <w:rPr>
@@ -3322,7 +3346,7 @@
               <w14:ligatures w14:val="standardContextual"/>
             </w:rPr>
           </w:pPr>
-          <w:hyperlink w:anchor="_Toc242301998" w:history="1">
+          <w:hyperlink w:anchor="_Toc242309406" w:history="1">
             <w:r>
               <w:rPr>
                 <w:rStyle w:val="Hyperlink"/>
@@ -3346,7 +3370,7 @@
               <w:rPr>
                 <w:noProof/>
               </w:rPr>
-              <w:instrText xml:space="preserve"> PAGEREF _Toc242301998 \h </w:instrText>
+              <w:instrText xml:space="preserve"> PAGEREF _Toc242309406 \h </w:instrText>
             </w:r>
             <w:r>
               <w:rPr>
@@ -3385,7 +3409,7 @@
         <w:pStyle w:val="Heading1"/>
         <w:pageBreakBefore/>
       </w:pPr>
-      <w:bookmarkStart w:id="0" w:name="_Toc242301952"/>
+      <w:bookmarkStart w:id="0" w:name="_Toc242309360"/>
       <w:r>
         <w:lastRenderedPageBreak/>
         <w:t>1. What YAV Shell is</w:t>
@@ -3562,7 +3586,7 @@
       <w:pPr>
         <w:pStyle w:val="Heading2"/>
       </w:pPr>
-      <w:bookmarkStart w:id="1" w:name="_Toc242301953"/>
+      <w:bookmarkStart w:id="1" w:name="_Toc242309361"/>
       <w:r>
         <w:t>1.1 Principles</w:t>
       </w:r>
@@ -3728,7 +3752,7 @@
       <w:pPr>
         <w:pStyle w:val="Heading2"/>
       </w:pPr>
-      <w:bookmarkStart w:id="2" w:name="_Toc242301954"/>
+      <w:bookmarkStart w:id="2" w:name="_Toc242309362"/>
       <w:r>
         <w:t>1.2 What this document covers</w:t>
       </w:r>
@@ -3783,7 +3807,7 @@
         <w:pStyle w:val="Heading1"/>
         <w:pageBreakBefore/>
       </w:pPr>
-      <w:bookmarkStart w:id="3" w:name="_Toc242301955"/>
+      <w:bookmarkStart w:id="3" w:name="_Toc242309363"/>
       <w:r>
         <w:lastRenderedPageBreak/>
         <w:t>2. Installing YAV Shell</w:t>
@@ -3794,7 +3818,7 @@
       <w:pPr>
         <w:pStyle w:val="Heading2"/>
       </w:pPr>
-      <w:bookmarkStart w:id="4" w:name="_Toc242301956"/>
+      <w:bookmarkStart w:id="4" w:name="_Toc242309364"/>
       <w:r>
         <w:t>2.1 Requirements</w:t>
       </w:r>
@@ -3951,7 +3975,7 @@
                 <w:sz w:val="20"/>
                 <w:szCs w:val="20"/>
               </w:rPr>
-              <w:t>YAV runs inside Windows Terminal, the PowerShell console or the CMD console. It opens no window of its own; double-clicked, it runs in the console window Windows opens for it.</w:t>
+              <w:t>The Windows YAV Shell was tested on; Windows 10 and Windows on ARM were not tried. YAV runs inside Windows Terminal, the PowerShell console or the CMD console. It opens no window of its own; double-clicked, it runs in the console window Windows opens for it.</w:t>
             </w:r>
           </w:p>
         </w:tc>
@@ -4018,7 +4042,7 @@
                 <w:sz w:val="20"/>
                 <w:szCs w:val="20"/>
               </w:rPr>
-              <w:t>Installed and signed in (section 2.7). YAV uses their accounts and billing. Tested with Codex CLI 0.158.x and 0.159.x and Claude Code 2.1.284 and 2.1.285; for other versions YAV warns.</w:t>
+              <w:t>At least one of them, installed and signed in (section 2.7). YAV uses their accounts and billing. Tested with Codex CLI 0.158.x and 0.159.x and Claude Code 2.1.284 and 2.1.285; for other versions YAV warns.</w:t>
             </w:r>
           </w:p>
         </w:tc>
@@ -4181,7 +4205,7 @@
       <w:pPr>
         <w:pStyle w:val="Heading2"/>
       </w:pPr>
-      <w:bookmarkStart w:id="5" w:name="_Toc242301957"/>
+      <w:bookmarkStart w:id="5" w:name="_Toc242309365"/>
       <w:r>
         <w:t>2.2 Run yav.exe</w:t>
       </w:r>
@@ -4238,19 +4262,19 @@
         <w:t>yav.exe.sha256</w:t>
       </w:r>
       <w:r>
-        <w:t xml:space="preserve">, and check it before you start it (section 2.6); or build it yourself with </w:t>
-      </w:r>
-      <w:r>
-        <w:rPr>
-          <w:rFonts w:ascii="Consolas" w:eastAsia="Consolas" w:hAnsi="Consolas" w:cs="Consolas"/>
-          <w:sz w:val="20"/>
-          <w:szCs w:val="20"/>
-          <w:shd w:val="clear" w:color="auto" w:fill="E8ECF1"/>
-        </w:rPr>
-        <w:t>scripts\package.ps1</w:t>
-      </w:r>
-      <w:r>
-        <w:t xml:space="preserve"> (Appendix A). The release also carries this guide, as </w:t>
+        <w:t xml:space="preserve">, and check it before you start it (section 2.6). Building it from the source (Appendix A) is permitted only to check that a published </w:t>
+      </w:r>
+      <w:r>
+        <w:rPr>
+          <w:rFonts w:ascii="Consolas" w:eastAsia="Consolas" w:hAnsi="Consolas" w:cs="Consolas"/>
+          <w:sz w:val="20"/>
+          <w:szCs w:val="20"/>
+          <w:shd w:val="clear" w:color="auto" w:fill="E8ECF1"/>
+        </w:rPr>
+        <w:t>yav.exe</w:t>
+      </w:r>
+      <w:r>
+        <w:t xml:space="preserve"> matches it (Appendix B). The release also carries this guide, as </w:t>
       </w:r>
       <w:r>
         <w:rPr>
@@ -4301,7 +4325,19 @@
         <w:t>Run it</w:t>
       </w:r>
       <w:r>
-        <w:t>: double-click it, or start it without arguments in a console. It also runs without being installed, from wherever it is. When YAV Shell is not installed for your user account, it says what installing changes and asks:</w:t>
+        <w:t xml:space="preserve">: double-click it, or start it without arguments in a console. </w:t>
+      </w:r>
+      <w:r>
+        <w:rPr>
+          <w:rFonts w:ascii="Consolas" w:eastAsia="Consolas" w:hAnsi="Consolas" w:cs="Consolas"/>
+          <w:sz w:val="20"/>
+          <w:szCs w:val="20"/>
+          <w:shd w:val="clear" w:color="auto" w:fill="E8ECF1"/>
+        </w:rPr>
+        <w:t>yav.exe</w:t>
+      </w:r>
+      <w:r>
+        <w:t xml:space="preserve"> is not code-signed: when Windows SmartScreen says “Windows protected your PC”, choose “More info”, then “Run anyway” (section 2.6); where Smart App Control is on, Windows does not start it at all. It also runs without being installed, from wherever it is. When YAV Shell is not installed for your user account, it says what installing changes and asks:</w:t>
       </w:r>
     </w:p>
     <w:p>
@@ -4486,6 +4522,7 @@
           <w:szCs w:val="20"/>
           <w:shd w:val="clear" w:color="auto" w:fill="E8ECF1"/>
         </w:rPr>
+        <w:lastRenderedPageBreak/>
         <w:t>yav.exe</w:t>
       </w:r>
       <w:r>
@@ -4513,7 +4550,43 @@
         <w:t>yav uninstall</w:t>
       </w:r>
       <w:r>
-        <w:t xml:space="preserve"> do not wait for Enter when they are done.</w:t>
+        <w:t xml:space="preserve"> do not wait for Enter when they are done. Nor does it ask where it is installed already: a copy installed with </w:t>
+      </w:r>
+      <w:r>
+        <w:rPr>
+          <w:rFonts w:ascii="Consolas" w:eastAsia="Consolas" w:hAnsi="Consolas" w:cs="Consolas"/>
+          <w:sz w:val="20"/>
+          <w:szCs w:val="20"/>
+          <w:shd w:val="clear" w:color="auto" w:fill="E8ECF1"/>
+        </w:rPr>
+        <w:t>--no-register</w:t>
+      </w:r>
+      <w:r>
+        <w:t xml:space="preserve">, or any </w:t>
+      </w:r>
+      <w:r>
+        <w:rPr>
+          <w:rFonts w:ascii="Consolas" w:eastAsia="Consolas" w:hAnsi="Consolas" w:cs="Consolas"/>
+          <w:sz w:val="20"/>
+          <w:szCs w:val="20"/>
+          <w:shd w:val="clear" w:color="auto" w:fill="E8ECF1"/>
+        </w:rPr>
+        <w:t>yav.exe</w:t>
+      </w:r>
+      <w:r>
+        <w:t xml:space="preserve"> that runs from a directory holding a </w:t>
+      </w:r>
+      <w:r>
+        <w:rPr>
+          <w:rFonts w:ascii="Consolas" w:eastAsia="Consolas" w:hAnsi="Consolas" w:cs="Consolas"/>
+          <w:sz w:val="20"/>
+          <w:szCs w:val="20"/>
+          <w:shd w:val="clear" w:color="auto" w:fill="E8ECF1"/>
+        </w:rPr>
+        <w:t>yav-install.json</w:t>
+      </w:r>
+      <w:r>
+        <w:t xml:space="preserve"> of YAV Shell, is not offered installation.</w:t>
       </w:r>
     </w:p>
     <w:p>
@@ -4521,7 +4594,6 @@
         <w:spacing w:after="120" w:line="276" w:lineRule="auto"/>
       </w:pPr>
       <w:r>
-        <w:lastRenderedPageBreak/>
         <w:t xml:space="preserve">Double-clicked, </w:t>
       </w:r>
       <w:r>
@@ -4542,7 +4614,7 @@
         <w:spacing w:after="120" w:line="276" w:lineRule="auto"/>
       </w:pPr>
       <w:r>
-        <w:t xml:space="preserve">The offer never keeps the shell from starting. When something goes wrong in it, while it finds out what is installed, asks, installs or saves your answer, YAV says which of these it was doing and what went wrong, and starts the shell. An installation that is refused is said on the error output; in a console that was open already the shell starts after it, and a window Windows opened for </w:t>
+        <w:t xml:space="preserve">In a console that was open already, the shell always starts after the offer. In a window Windows opened for </w:t>
       </w:r>
       <w:r>
         <w:rPr>
@@ -4554,7 +4626,7 @@
         <w:t>yav.exe</w:t>
       </w:r>
       <w:r>
-        <w:t xml:space="preserve"> shows it until you press Enter and then closes (exit code 5).</w:t>
+        <w:t>, the window closes after the installation, once you press Enter: with exit code 0 when it worked, and with 5 when it was refused or failed, the reason on the error output. Only when the offer itself goes wrong (while it finds out what is installed, asks or saves your answer, or with an error YAV did not expect) does YAV say which step it was in and what went wrong, and start the shell.</w:t>
       </w:r>
     </w:p>
     <w:p>
@@ -4618,7 +4690,7 @@
       <w:pPr>
         <w:pStyle w:val="Heading2"/>
       </w:pPr>
-      <w:bookmarkStart w:id="6" w:name="_Toc242301958"/>
+      <w:bookmarkStart w:id="6" w:name="_Toc242309366"/>
       <w:r>
         <w:t>2.3 Consoles that were open already</w:t>
       </w:r>
@@ -4744,7 +4816,7 @@
       <w:pPr>
         <w:pStyle w:val="Heading2"/>
       </w:pPr>
-      <w:bookmarkStart w:id="7" w:name="_Toc242301959"/>
+      <w:bookmarkStart w:id="7" w:name="_Toc242309367"/>
       <w:r>
         <w:t>2.4 yav install and yav uninstall</w:t>
       </w:r>
@@ -5137,6 +5209,7 @@
                 <w:szCs w:val="20"/>
                 <w:shd w:val="clear" w:color="auto" w:fill="E8ECF1"/>
               </w:rPr>
+              <w:lastRenderedPageBreak/>
               <w:t>--no-register</w:t>
             </w:r>
           </w:p>
@@ -5252,7 +5325,7 @@
                 <w:sz w:val="20"/>
                 <w:szCs w:val="20"/>
               </w:rPr>
-              <w:t>; where nobody can be asked, nothing is removed, the program neither</w:t>
+              <w:t>; where nobody can be asked, nothing is removed, the program neither. When YAV Shell is not installed, nothing is asked and nothing is removed; YAV says so, and that the data folder can be deleted by hand</w:t>
             </w:r>
           </w:p>
         </w:tc>
@@ -5274,7 +5347,6 @@
           <w:szCs w:val="20"/>
           <w:shd w:val="clear" w:color="auto" w:fill="E8ECF1"/>
         </w:rPr>
-        <w:lastRenderedPageBreak/>
         <w:t>yav install</w:t>
       </w:r>
       <w:r>
@@ -5439,19 +5511,7 @@
         <w:t>YavShell/</w:t>
       </w:r>
       <w:r>
-        <w:t xml:space="preserve">), or name </w:t>
-      </w:r>
-      <w:r>
-        <w:rPr>
-          <w:rFonts w:ascii="Consolas" w:eastAsia="Consolas" w:hAnsi="Consolas" w:cs="Consolas"/>
-          <w:sz w:val="20"/>
-          <w:szCs w:val="20"/>
-          <w:shd w:val="clear" w:color="auto" w:fill="E8ECF1"/>
-        </w:rPr>
-        <w:t>--remove-data</w:t>
-      </w:r>
-      <w:r>
-        <w:t>.</w:t>
+        <w:t>).</w:t>
       </w:r>
     </w:p>
     <w:p>
@@ -5902,7 +5962,11 @@
         <w:t>dist\yav.exe</w:t>
       </w:r>
       <w:r>
-        <w:t xml:space="preserve"> (Appendix A). Such a build removes only an installation you name with </w:t>
+        <w:t xml:space="preserve"> (Appendix A). Such a build removes </w:t>
+      </w:r>
+      <w:r>
+        <w:lastRenderedPageBreak/>
+        <w:t xml:space="preserve">only an installation you name with </w:t>
       </w:r>
       <w:r>
         <w:rPr>
@@ -5933,7 +5997,7 @@
       <w:pPr>
         <w:pStyle w:val="Heading2"/>
       </w:pPr>
-      <w:bookmarkStart w:id="8" w:name="_Toc242301960"/>
+      <w:bookmarkStart w:id="8" w:name="_Toc242309368"/>
       <w:r>
         <w:t>2.5 Updating and repair</w:t>
       </w:r>
@@ -5987,11 +6051,7 @@
         <w:t>yav install</w:t>
       </w:r>
       <w:r>
-        <w:t xml:space="preserve"> started from the installed program </w:t>
-      </w:r>
-      <w:r>
-        <w:lastRenderedPageBreak/>
-        <w:t>itself repairs the installation: the program stays as it is, and the files that belong with it, the PATH entry and the entry under “Installed apps” are put right.</w:t>
+        <w:t xml:space="preserve"> started from the installed program itself repairs the installation: the program stays as it is, and the files that belong with it, the PATH entry and the entry under “Installed apps” are put right.</w:t>
       </w:r>
     </w:p>
     <w:p>
@@ -6159,7 +6219,7 @@
         <w:t>yav uninstall --dir "&lt;dir&gt;"</w:t>
       </w:r>
       <w:r>
-        <w:t xml:space="preserve"> removes the files. Ctrl+C stops an installation between two files; YAV then says that </w:t>
+        <w:t xml:space="preserve"> removes the files. Ctrl+C stops an installation between two files, also one started from the offer at the start; YAV then says that </w:t>
       </w:r>
       <w:r>
         <w:rPr>
@@ -6238,7 +6298,7 @@
       <w:pPr>
         <w:pStyle w:val="Heading2"/>
       </w:pPr>
-      <w:bookmarkStart w:id="9" w:name="_Toc242301961"/>
+      <w:bookmarkStart w:id="9" w:name="_Toc242309369"/>
       <w:r>
         <w:t>2.6 A downloaded yav.exe</w:t>
       </w:r>
@@ -6476,6 +6536,42 @@
         <w:spacing w:after="120" w:line="276" w:lineRule="auto"/>
       </w:pPr>
       <w:r>
+        <w:rPr>
+          <w:b/>
+          <w:bCs/>
+        </w:rPr>
+        <w:t>A published release stays as it was published.</w:t>
+      </w:r>
+      <w:r>
+        <w:t xml:space="preserve"> Releases of the repository are immutable: the files and the tag of a published release cannot be changed afterwards. This command checks the attestation GitHub made of the release, a record of its tag, its commit and its files, in addition to the attestation of the build above:</w:t>
+      </w:r>
+    </w:p>
+    <w:p>
+      <w:pPr>
+        <w:pBdr>
+          <w:top w:val="nil"/>
+          <w:left w:val="single" w:sz="18" w:space="8" w:color="2E74B5"/>
+          <w:bottom w:val="nil"/>
+        </w:pBdr>
+        <w:shd w:val="clear" w:color="auto" w:fill="F3F4F6"/>
+        <w:spacing w:after="160" w:line="252" w:lineRule="auto"/>
+        <w:ind w:left="227" w:right="227"/>
+      </w:pPr>
+      <w:r>
+        <w:rPr>
+          <w:rFonts w:ascii="Consolas" w:eastAsia="Consolas" w:hAnsi="Consolas" w:cs="Consolas"/>
+          <w:sz w:val="18"/>
+          <w:szCs w:val="18"/>
+        </w:rPr>
+        <w:t>gh release verify v0.2.0 -R Yavinesh2025/yav-shell</w:t>
+      </w:r>
+    </w:p>
+    <w:p>
+      <w:pPr>
+        <w:spacing w:after="120" w:line="276" w:lineRule="auto"/>
+      </w:pPr>
+      <w:r>
+        <w:lastRenderedPageBreak/>
         <w:t xml:space="preserve">Windows SmartScreen may stop a downloaded </w:t>
       </w:r>
       <w:r>
@@ -6488,7 +6584,7 @@
         <w:t>yav.exe</w:t>
       </w:r>
       <w:r>
-        <w:t xml:space="preserve"> the first time with “Windows protected your PC”; “More info” and then “Run anyway” start it. The installation writes </w:t>
+        <w:t xml:space="preserve"> the first time with “Windows protected your PC”: once both checks have passed, choose “More info”, then “Run anyway”. The installation writes </w:t>
       </w:r>
       <w:r>
         <w:rPr>
@@ -6540,7 +6636,7 @@
       <w:pPr>
         <w:pStyle w:val="Heading2"/>
       </w:pPr>
-      <w:bookmarkStart w:id="10" w:name="_Toc242301962"/>
+      <w:bookmarkStart w:id="10" w:name="_Toc242309370"/>
       <w:r>
         <w:t>2.7 Installing the agents</w:t>
       </w:r>
@@ -6571,7 +6667,6 @@
           <w:sz w:val="18"/>
           <w:szCs w:val="18"/>
         </w:rPr>
-        <w:lastRenderedPageBreak/>
         <w:t># Codex CLI (OpenAI); then sign in with: codex login</w:t>
       </w:r>
     </w:p>
@@ -6610,7 +6705,7 @@
           <w:sz w:val="18"/>
           <w:szCs w:val="18"/>
         </w:rPr>
-        <w:t># Claude Code (Anthropic); then start claude and sign in, or: claude auth login</w:t>
+        <w:t># Claude Code (Anthropic); then sign in with: claude auth login (or start claude and sign in)</w:t>
       </w:r>
     </w:p>
     <w:p>
@@ -6704,7 +6799,7 @@
       <w:pPr>
         <w:pStyle w:val="Heading2"/>
       </w:pPr>
-      <w:bookmarkStart w:id="11" w:name="_Toc242301963"/>
+      <w:bookmarkStart w:id="11" w:name="_Toc242309371"/>
       <w:r>
         <w:t>2.8 Ways to start YAV</w:t>
       </w:r>
@@ -7430,7 +7525,7 @@
         <w:pStyle w:val="Heading1"/>
         <w:pageBreakBefore/>
       </w:pPr>
-      <w:bookmarkStart w:id="12" w:name="_Toc242301964"/>
+      <w:bookmarkStart w:id="12" w:name="_Toc242309372"/>
       <w:r>
         <w:lastRenderedPageBreak/>
         <w:t>3. The first request</w:t>
@@ -8718,7 +8813,7 @@
         <w:pStyle w:val="Heading1"/>
         <w:pageBreakBefore/>
       </w:pPr>
-      <w:bookmarkStart w:id="13" w:name="_Toc242301965"/>
+      <w:bookmarkStart w:id="13" w:name="_Toc242309373"/>
       <w:r>
         <w:lastRenderedPageBreak/>
         <w:t>4. The shell</w:t>
@@ -8729,7 +8824,7 @@
       <w:pPr>
         <w:pStyle w:val="Heading2"/>
       </w:pPr>
-      <w:bookmarkStart w:id="14" w:name="_Toc242301966"/>
+      <w:bookmarkStart w:id="14" w:name="_Toc242309374"/>
       <w:r>
         <w:t>4.1 What you type</w:t>
       </w:r>
@@ -9118,7 +9213,7 @@
       <w:pPr>
         <w:pStyle w:val="Heading2"/>
       </w:pPr>
-      <w:bookmarkStart w:id="15" w:name="_Toc242301967"/>
+      <w:bookmarkStart w:id="15" w:name="_Toc242309375"/>
       <w:r>
         <w:t>4.2 Keys</w:t>
       </w:r>
@@ -9789,7 +9884,7 @@
       <w:pPr>
         <w:pStyle w:val="Heading2"/>
       </w:pPr>
-      <w:bookmarkStart w:id="16" w:name="_Toc242301968"/>
+      <w:bookmarkStart w:id="16" w:name="_Toc242309376"/>
       <w:r>
         <w:t>4.3 When an agent asks for approval</w:t>
       </w:r>
@@ -10548,7 +10643,7 @@
         <w:pStyle w:val="Heading1"/>
         <w:pageBreakBefore/>
       </w:pPr>
-      <w:bookmarkStart w:id="17" w:name="_Toc242301969"/>
+      <w:bookmarkStart w:id="17" w:name="_Toc242309377"/>
       <w:r>
         <w:lastRenderedPageBreak/>
         <w:t>5. A run</w:t>
@@ -10867,7 +10962,7 @@
       <w:pPr>
         <w:pStyle w:val="Heading2"/>
       </w:pPr>
-      <w:bookmarkStart w:id="18" w:name="_Toc242301970"/>
+      <w:bookmarkStart w:id="18" w:name="_Toc242309378"/>
       <w:r>
         <w:t>5.1 How a run ends</w:t>
       </w:r>
@@ -11922,7 +12017,7 @@
         <w:pStyle w:val="Heading1"/>
         <w:pageBreakBefore/>
       </w:pPr>
-      <w:bookmarkStart w:id="19" w:name="_Toc242301971"/>
+      <w:bookmarkStart w:id="19" w:name="_Toc242309379"/>
       <w:r>
         <w:lastRenderedPageBreak/>
         <w:t>6. Commands</w:t>
@@ -11972,7 +12067,7 @@
       <w:pPr>
         <w:pStyle w:val="Heading2"/>
       </w:pPr>
-      <w:bookmarkStart w:id="20" w:name="_Toc242301972"/>
+      <w:bookmarkStart w:id="20" w:name="_Toc242309380"/>
       <w:r>
         <w:t>6.1 Project</w:t>
       </w:r>
@@ -12262,7 +12357,7 @@
       <w:pPr>
         <w:pStyle w:val="Heading2"/>
       </w:pPr>
-      <w:bookmarkStart w:id="21" w:name="_Toc242301973"/>
+      <w:bookmarkStart w:id="21" w:name="_Toc242309381"/>
       <w:r>
         <w:t>6.2 Models and policy</w:t>
       </w:r>
@@ -13429,7 +13524,7 @@
       <w:pPr>
         <w:pStyle w:val="Heading2"/>
       </w:pPr>
-      <w:bookmarkStart w:id="22" w:name="_Toc242301974"/>
+      <w:bookmarkStart w:id="22" w:name="_Toc242309382"/>
       <w:r>
         <w:t>6.3 Task</w:t>
       </w:r>
@@ -14108,7 +14203,7 @@
       <w:pPr>
         <w:pStyle w:val="Heading2"/>
       </w:pPr>
-      <w:bookmarkStart w:id="23" w:name="_Toc242301975"/>
+      <w:bookmarkStart w:id="23" w:name="_Toc242309383"/>
       <w:r>
         <w:t>6.4 A change you spell out: /replace</w:t>
       </w:r>
@@ -14302,7 +14397,7 @@
       <w:pPr>
         <w:pStyle w:val="Heading2"/>
       </w:pPr>
-      <w:bookmarkStart w:id="24" w:name="_Toc242301976"/>
+      <w:bookmarkStart w:id="24" w:name="_Toc242309384"/>
       <w:r>
         <w:lastRenderedPageBreak/>
         <w:t>6.5 Inspect and check</w:t>
@@ -14963,7 +15058,7 @@
       <w:pPr>
         <w:pStyle w:val="Heading2"/>
       </w:pPr>
-      <w:bookmarkStart w:id="25" w:name="_Toc242301977"/>
+      <w:bookmarkStart w:id="25" w:name="_Toc242309385"/>
       <w:r>
         <w:t>6.6 Deliver</w:t>
       </w:r>
@@ -15408,7 +15503,7 @@
       <w:pPr>
         <w:pStyle w:val="Heading2"/>
       </w:pPr>
-      <w:bookmarkStart w:id="26" w:name="_Toc242301978"/>
+      <w:bookmarkStart w:id="26" w:name="_Toc242309386"/>
       <w:r>
         <w:t>6.7 Records</w:t>
       </w:r>
@@ -15915,17 +16010,17 @@
         <w:t>/latency</w:t>
       </w:r>
       <w:r>
-        <w:t xml:space="preserve"> shows how long the console took to start and to answer commands, and for a run every stage from the first look at the project to the apply. Stages that ran side by side are not added up. The time a candidate waited for your decision is “waiting for you” and not part of the active time, and what no stage accounts for is shown as such, so that the stages never pass for the whole. The time the agents spent in tools they ran, such as commands, is measured from what they report and shown apart. What is left of </w:t>
-      </w:r>
-      <w:r>
-        <w:t>a turn is provider time: waiting, reasoning and answering, which no provider tells apart. What is kept with a measurement never includes a request or a command.</w:t>
+        <w:t xml:space="preserve"> shows how long the console took to start and to answer commands, and for a run every stage from the first look at the project to the apply. Stages that ran side by side are not added up. The time a candidate waited for your decision is “waiting for you” and not part of the active time, and what no stage accounts for is shown as such, so that the stages never pass for the whole. The time the agents spent in tools they ran, such as commands, is measured from what they report and shown apart: from when an age</w:t>
+      </w:r>
+      <w:r>
+        <w:t>nt reported the start of a tool's run to when it reported its end, at the times YAV received those reports, not when it handled them. What is left of a turn is provider time: waiting, reasoning and answering, which no provider tells apart. What is kept with a measurement never includes a request or a command.</w:t>
       </w:r>
     </w:p>
     <w:p>
       <w:pPr>
         <w:pStyle w:val="Heading2"/>
       </w:pPr>
-      <w:bookmarkStart w:id="27" w:name="_Toc242301979"/>
+      <w:bookmarkStart w:id="27" w:name="_Toc242309387"/>
       <w:r>
         <w:t>6.8 Local, without a model</w:t>
       </w:r>
@@ -16233,7 +16328,7 @@
       <w:pPr>
         <w:pStyle w:val="Heading2"/>
       </w:pPr>
-      <w:bookmarkStart w:id="28" w:name="_Toc242301980"/>
+      <w:bookmarkStart w:id="28" w:name="_Toc242309388"/>
       <w:r>
         <w:t>6.9 Application</w:t>
       </w:r>
@@ -16800,7 +16895,7 @@
         <w:pStyle w:val="Heading1"/>
         <w:pageBreakBefore/>
       </w:pPr>
-      <w:bookmarkStart w:id="29" w:name="_Toc242301981"/>
+      <w:bookmarkStart w:id="29" w:name="_Toc242309389"/>
       <w:r>
         <w:lastRenderedPageBreak/>
         <w:t>7. Quality Lock, checks, effort and adaptive mode</w:t>
@@ -16811,7 +16906,7 @@
       <w:pPr>
         <w:pStyle w:val="Heading2"/>
       </w:pPr>
-      <w:bookmarkStart w:id="30" w:name="_Toc242301982"/>
+      <w:bookmarkStart w:id="30" w:name="_Toc242309390"/>
       <w:r>
         <w:t>7.1 Quality Lock</w:t>
       </w:r>
@@ -16881,7 +16976,7 @@
       <w:pPr>
         <w:pStyle w:val="Heading2"/>
       </w:pPr>
-      <w:bookmarkStart w:id="31" w:name="_Toc242301983"/>
+      <w:bookmarkStart w:id="31" w:name="_Toc242309391"/>
       <w:r>
         <w:t>7.2 Required checks and review-only acceptance</w:t>
       </w:r>
@@ -17107,7 +17202,7 @@
       <w:pPr>
         <w:pStyle w:val="Heading2"/>
       </w:pPr>
-      <w:bookmarkStart w:id="32" w:name="_Toc242301984"/>
+      <w:bookmarkStart w:id="32" w:name="_Toc242309392"/>
       <w:r>
         <w:t>7.3 Effort</w:t>
       </w:r>
@@ -17165,7 +17260,7 @@
       <w:pPr>
         <w:pStyle w:val="Heading2"/>
       </w:pPr>
-      <w:bookmarkStart w:id="33" w:name="_Toc242301985"/>
+      <w:bookmarkStart w:id="33" w:name="_Toc242309393"/>
       <w:r>
         <w:t>7.4 Adaptive mode</w:t>
       </w:r>
@@ -17204,7 +17299,7 @@
         <w:pStyle w:val="Heading1"/>
         <w:pageBreakBefore/>
       </w:pPr>
-      <w:bookmarkStart w:id="34" w:name="_Toc242301986"/>
+      <w:bookmarkStart w:id="34" w:name="_Toc242309394"/>
       <w:r>
         <w:lastRenderedPageBreak/>
         <w:t>8. Checks of a project: yav.project.json</w:t>
@@ -19122,7 +19217,7 @@
         <w:pStyle w:val="Heading1"/>
         <w:pageBreakBefore/>
       </w:pPr>
-      <w:bookmarkStart w:id="35" w:name="_Toc242301987"/>
+      <w:bookmarkStart w:id="35" w:name="_Toc242309395"/>
       <w:r>
         <w:lastRenderedPageBreak/>
         <w:t>9. Without a prompt: yav run</w:t>
@@ -20053,7 +20148,7 @@
         <w:pStyle w:val="Heading1"/>
         <w:pageBreakBefore/>
       </w:pPr>
-      <w:bookmarkStart w:id="36" w:name="_Toc242301988"/>
+      <w:bookmarkStart w:id="36" w:name="_Toc242309396"/>
       <w:r>
         <w:lastRenderedPageBreak/>
         <w:t>10. JSON output</w:t>
@@ -22396,7 +22491,7 @@
         <w:pStyle w:val="Heading1"/>
         <w:pageBreakBefore/>
       </w:pPr>
-      <w:bookmarkStart w:id="37" w:name="_Toc242301989"/>
+      <w:bookmarkStart w:id="37" w:name="_Toc242309397"/>
       <w:r>
         <w:lastRenderedPageBreak/>
         <w:t>11. Where things are kept</w:t>
@@ -23046,7 +23141,7 @@
         <w:t>yav.exe</w:t>
       </w:r>
       <w:r>
-        <w:t xml:space="preserve"> unpacks the native SQLite library into </w:t>
+        <w:t xml:space="preserve"> unpacks the native SQLite library (SQLite 3.53.3, as built by SQLitePCLRaw.lib.e_sqlite3 2.1.12) into </w:t>
       </w:r>
       <w:r>
         <w:rPr>
@@ -23098,7 +23193,7 @@
         <w:pStyle w:val="Heading1"/>
         <w:pageBreakBefore/>
       </w:pPr>
-      <w:bookmarkStart w:id="38" w:name="_Toc242301990"/>
+      <w:bookmarkStart w:id="38" w:name="_Toc242309398"/>
       <w:r>
         <w:lastRenderedPageBreak/>
         <w:t>12. Limits, and what was verified</w:t>
@@ -23109,7 +23204,7 @@
       <w:pPr>
         <w:pStyle w:val="Heading2"/>
       </w:pPr>
-      <w:bookmarkStart w:id="39" w:name="_Toc242301991"/>
+      <w:bookmarkStart w:id="39" w:name="_Toc242309399"/>
       <w:r>
         <w:t>12.1 Limits of what YAV can know</w:t>
       </w:r>
@@ -23196,7 +23291,7 @@
       <w:pPr>
         <w:pStyle w:val="Heading2"/>
       </w:pPr>
-      <w:bookmarkStart w:id="40" w:name="_Toc242301992"/>
+      <w:bookmarkStart w:id="40" w:name="_Toc242309400"/>
       <w:r>
         <w:t>12.2 What was verified for version 0.2.0</w:t>
       </w:r>
@@ -23440,7 +23535,7 @@
                 <w:sz w:val="20"/>
                 <w:szCs w:val="20"/>
               </w:rPr>
-              <w:t>2612 of 2612 passed. They use a scripted stand-in for the agents</w:t>
+              <w:t>2637 of 2637 passed. They use a scripted stand-in for the agents</w:t>
             </w:r>
           </w:p>
         </w:tc>
@@ -23540,7 +23635,7 @@
                 <w:sz w:val="20"/>
                 <w:szCs w:val="20"/>
               </w:rPr>
-              <w:t>456 defects were put into the code one at a time (the whole list; 112 of the entries are new for 0.2.0); the tests noticed 456 of them</w:t>
+              <w:t>456 defects were put into the code one at a time (the whole list, before the corrections made after publication, 112 of the entries new for 0.2.0; after the corrections, the 17 entries of the changed code, 17 of them new, were run again, and the tests noticed 17 of 17); the tests noticed 456 of them</w:t>
             </w:r>
           </w:p>
         </w:tc>
@@ -23646,7 +23741,7 @@
                 <w:sz w:val="20"/>
                 <w:szCs w:val="20"/>
               </w:rPr>
-              <w:t>, 95.6 MB, self-contained. Nothing is code-signed</w:t>
+              <w:t>, 95.7 MB, self-contained. Nothing is code-signed</w:t>
             </w:r>
           </w:p>
         </w:tc>
@@ -23746,7 +23841,7 @@
                 <w:sz w:val="20"/>
                 <w:szCs w:val="20"/>
               </w:rPr>
-              <w:t>118 ms the first time, 62 ms later</w:t>
+              <w:t>160 ms the first time, 71 ms later</w:t>
             </w:r>
           </w:p>
         </w:tc>
@@ -24094,6 +24189,7 @@
                 <w:sz w:val="20"/>
                 <w:szCs w:val="20"/>
               </w:rPr>
+              <w:lastRenderedPageBreak/>
               <w:t>A request worked on by real models</w:t>
             </w:r>
           </w:p>
@@ -24202,7 +24298,6 @@
                 <w:sz w:val="20"/>
                 <w:szCs w:val="20"/>
               </w:rPr>
-              <w:lastRenderedPageBreak/>
               <w:t>A benchmark with real models</w:t>
             </w:r>
           </w:p>
@@ -24314,7 +24409,7 @@
         <w:t>scripts\package.ps1</w:t>
       </w:r>
       <w:r>
-        <w:t xml:space="preserve"> built on that machine. Its SHA-256, as </w:t>
+        <w:t xml:space="preserve"> built on that machine, the development PC. Its SHA-256, as </w:t>
       </w:r>
       <w:r>
         <w:rPr>
@@ -24346,7 +24441,7 @@
           <w:sz w:val="18"/>
           <w:szCs w:val="18"/>
         </w:rPr>
-        <w:t>4f19327b057874b1d314006e3f27df5cab1ff138988d3c18164a05f4512b11cb</w:t>
+        <w:t>f2c3f05f53a28c9c1ac9e5d12566cd4dd75e4a01bea69a8612fb9c987bce2b59</w:t>
       </w:r>
     </w:p>
     <w:p>
@@ -24390,14 +24485,14 @@
         <w:t>scripts\verify-package.ps1</w:t>
       </w:r>
       <w:r>
-        <w:t xml:space="preserve"> there, and gives its own SHA-256 in the release text and in the attestation GitHub records for it (section 2.6). That file was not run in Windows Sandbox. On the runner, the tests that need PowerShell from the Microsoft Store are reported as skipped, that is, not run.</w:t>
+        <w:t xml:space="preserve"> there, and gives its own SHA-256 in the release text and in the attestation GitHub records for it (section 2.6). That file was not run in Windows Sandbox. On GitHub's runner, which has no PowerShell from the Microsoft Store, the tests that need it are reported as not run.</w:t>
       </w:r>
     </w:p>
     <w:p>
       <w:pPr>
         <w:pStyle w:val="Heading2"/>
       </w:pPr>
-      <w:bookmarkStart w:id="41" w:name="_Toc242301993"/>
+      <w:bookmarkStart w:id="41" w:name="_Toc242309401"/>
       <w:r>
         <w:t>12.3 Not verified for version 0.2.0</w:t>
       </w:r>
@@ -24638,7 +24733,11 @@
         <w:t>cmd.exe</w:t>
       </w:r>
       <w:r>
-        <w:t xml:space="preserve"> was started after the installation with the PATH that Windows puts together from that of the machine and that of the user, and found </w:t>
+        <w:t xml:space="preserve"> was started after the installation with the PATH that Windows puts together from that of the machine </w:t>
+      </w:r>
+      <w:r>
+        <w:lastRenderedPageBreak/>
+        <w:t xml:space="preserve">and that of the user, and found </w:t>
       </w:r>
       <w:r>
         <w:rPr>
@@ -24705,7 +24804,6 @@
           <w:b/>
           <w:bCs/>
         </w:rPr>
-        <w:lastRenderedPageBreak/>
         <w:t>Updating an installation.</w:t>
       </w:r>
       <w:r>
@@ -25111,6 +25209,7 @@
           <w:b/>
           <w:bCs/>
         </w:rPr>
+        <w:lastRenderedPageBreak/>
         <w:t>A signed package.</w:t>
       </w:r>
       <w:r>
@@ -25151,7 +25250,6 @@
           <w:b/>
           <w:bCs/>
         </w:rPr>
-        <w:lastRenderedPageBreak/>
         <w:t>Git LFS and submodules in use.</w:t>
       </w:r>
       <w:r>
@@ -25182,7 +25280,7 @@
       <w:pPr>
         <w:pStyle w:val="Heading2"/>
       </w:pPr>
-      <w:bookmarkStart w:id="42" w:name="_Toc242301994"/>
+      <w:bookmarkStart w:id="42" w:name="_Toc242309402"/>
       <w:r>
         <w:t>12.4 What was verified for version 0.1.1</w:t>
       </w:r>
@@ -26238,7 +26336,7 @@
         <w:pStyle w:val="Heading1"/>
         <w:pageBreakBefore/>
       </w:pPr>
-      <w:bookmarkStart w:id="43" w:name="_Toc242301995"/>
+      <w:bookmarkStart w:id="43" w:name="_Toc242309403"/>
       <w:r>
         <w:lastRenderedPageBreak/>
         <w:t>Appendix A. Build and test from source</w:t>
@@ -27288,7 +27386,7 @@
       <w:pPr>
         <w:pStyle w:val="Heading2"/>
       </w:pPr>
-      <w:bookmarkStart w:id="44" w:name="_Toc242301996"/>
+      <w:bookmarkStart w:id="44" w:name="_Toc242309404"/>
       <w:r>
         <w:t>A.1 On GitHub: CI and releases</w:t>
       </w:r>
@@ -27415,7 +27513,7 @@
         <w:t>scripts\test.ps1 -Configuration Release -HangSeconds 900</w:t>
       </w:r>
       <w:r>
-        <w:t xml:space="preserve"> (the scripted stand-in only; no model is asked; a test that hangs ends the run after 15 minutes and is named), </w:t>
+        <w:t xml:space="preserve"> (the scripted stand-in only; no model is asked; a test that hangs ends the run after 15 minutes and is named; the tests that need PowerShell from the Microsoft Store are reported as not run, because the runner has none), </w:t>
       </w:r>
       <w:r>
         <w:rPr>
@@ -27436,6 +27534,7 @@
           <w:szCs w:val="20"/>
           <w:shd w:val="clear" w:color="auto" w:fill="E8ECF1"/>
         </w:rPr>
+        <w:lastRenderedPageBreak/>
         <w:t>scripts\verify-package.ps1</w:t>
       </w:r>
       <w:r>
@@ -27468,7 +27567,6 @@
           <w:b/>
           <w:bCs/>
         </w:rPr>
-        <w:lastRenderedPageBreak/>
         <w:t>Never there:</w:t>
       </w:r>
       <w:r>
@@ -27635,7 +27733,19 @@
         <w:t>Directory.Build.props</w:t>
       </w:r>
       <w:r>
-        <w:t xml:space="preserve"> is refused, and so is a release whose notes, guide or specification are missing, or whose documentation still holds a placeholder for a result; a release is never replaced. Its text gives the SHA-256 of each document.</w:t>
+        <w:t xml:space="preserve"> is refused, and so is a release whose notes, guide or specification are missing, or whose documentation still holds a placeholder for a result; a release is never replaced. Releases of the repository are immutable: the files and the tag of a published release cannot be changed, and GitHub records an attestation of the release, which </w:t>
+      </w:r>
+      <w:r>
+        <w:rPr>
+          <w:rFonts w:ascii="Consolas" w:eastAsia="Consolas" w:hAnsi="Consolas" w:cs="Consolas"/>
+          <w:sz w:val="20"/>
+          <w:szCs w:val="20"/>
+          <w:shd w:val="clear" w:color="auto" w:fill="E8ECF1"/>
+        </w:rPr>
+        <w:t>gh release verify</w:t>
+      </w:r>
+      <w:r>
+        <w:t xml:space="preserve"> checks (section 2.6). Its text gives the SHA-256 of each document.</w:t>
       </w:r>
     </w:p>
     <w:p>
@@ -27715,7 +27825,7 @@
         <w:pStyle w:val="Heading1"/>
         <w:pageBreakBefore/>
       </w:pPr>
-      <w:bookmarkStart w:id="45" w:name="_Toc242301997"/>
+      <w:bookmarkStart w:id="45" w:name="_Toc242309405"/>
       <w:r>
         <w:lastRenderedPageBreak/>
         <w:t>Appendix B. How the program is built</w:t>
@@ -28921,7 +29031,7 @@
       <w:pPr>
         <w:pStyle w:val="Heading2"/>
       </w:pPr>
-      <w:bookmarkStart w:id="46" w:name="_Toc242301998"/>
+      <w:bookmarkStart w:id="46" w:name="_Toc242309406"/>
       <w:r>
         <w:t>Further reading in the project</w:t>
       </w:r>
@@ -29820,7 +29930,7 @@
         <w:t>yav.exe</w:t>
       </w:r>
       <w:r>
-        <w:t xml:space="preserve"> matches it, is permitted. Copying, modifying or redistributing YAV Shell or any part of it needs the prior written permission of the copyright holder. YAV Shell is provided “as is”, without warranty of any kind. The terms are in </w:t>
+        <w:t xml:space="preserve"> matches it, is permitted. Copying, modifying or redistributing YAV Shell or any part of it needs the prior written permission of the copyright holder. Viewing and forking the repository on GitHub, as GitHub's Terms of Service permit for public repositories, is permitted; a fork grants no rights beyond those the license states. YAV Shell is provided “as is”, without warranty of any kind. The terms are in </w:t>
       </w:r>
       <w:r>
         <w:rPr>
@@ -30052,64 +30162,10 @@
 <file path=word/numbering.xml><?xml version="1.0" encoding="utf-8"?>
 <w:numbering xmlns:wpc="http://schemas.microsoft.com/office/word/2010/wordprocessingCanvas" xmlns:cx="http://schemas.microsoft.com/office/drawing/2014/chartex" xmlns:cx1="http://schemas.microsoft.com/office/drawing/2015/9/8/chartex" xmlns:cx2="http://schemas.microsoft.com/office/drawing/2015/10/21/chartex" xmlns:cx3="http://schemas.microsoft.com/office/drawing/2016/5/9/chartex" xmlns:cx4="http://schemas.microsoft.com/office/drawing/2016/5/10/chartex" xmlns:cx5="http://schemas.microsoft.com/office/drawing/2016/5/11/chartex" xmlns:cx6="http://schemas.microsoft.com/office/drawing/2016/5/12/chartex" xmlns:cx7="http://schemas.microsoft.com/office/drawing/2016/5/13/chartex" xmlns:cx8="http://schemas.microsoft.com/office/drawing/2016/5/14/chartex" xmlns:mc="http://schemas.openxmlformats.org/markup-compatibility/2006" xmlns:aink="http://schemas.microsoft.com/office/drawing/2016/ink" xmlns:am3d="http://schemas.microsoft.com/office/drawing/2017/model3d" xmlns:o="urn:schemas-microsoft-com:office:office" xmlns:oel="http://schemas.microsoft.com/office/2019/extlst" xmlns:r="http://schemas.openxmlformats.org/officeDocument/2006/relationships" xmlns:m="http://schemas.openxmlformats.org/officeDocument/2006/math" xmlns:v="urn:schemas-microsoft-com:vml" xmlns:wp14="http://schemas.microsoft.com/office/word/2010/wordprocessingDrawing" xmlns:wp="http://schemas.openxmlformats.org/drawingml/2006/wordprocessingDrawing" xmlns:w10="urn:schemas-microsoft-com:office:word" xmlns:w="http://schemas.openxmlformats.org/wordprocessingml/2006/main" xmlns:w14="http://schemas.microsoft.com/office/word/2010/wordml" xmlns:w15="http://schemas.microsoft.com/office/word/2012/wordml" xmlns:w16cex="http://schemas.microsoft.com/office/word/2018/wordml/cex" xmlns:w16cid="http://schemas.microsoft.com/office/word/2016/wordml/cid" xmlns:w16="http://schemas.microsoft.com/office/word/2018/wordml" xmlns:w16du="http://schemas.microsoft.com/office/word/2023/wordml/word16du" xmlns:w16sdtdh="http://schemas.microsoft.com/office/word/2020/wordml/sdtdatahash" xmlns:w16sdtfl="http://schemas.microsoft.com/office/word/2024/wordml/sdtformatlock" xmlns:w16se="http://schemas.microsoft.com/office/word/2015/wordml/symex" xmlns:wpg="http://schemas.microsoft.com/office/word/2010/wordprocessingGroup" xmlns:wpi="http://schemas.microsoft.com/office/word/2010/wordprocessingInk" xmlns:wne="http://schemas.microsoft.com/office/word/2006/wordml" xmlns:wps="http://schemas.microsoft.com/office/word/2010/wordprocessingShape" mc:Ignorable="w14 w15 w16se w16cid w16 w16cex w16sdtdh w16sdtfl w16du wp14">
   <w:abstractNum w:abstractNumId="0" w15:restartNumberingAfterBreak="0">
-    <w:nsid w:val="4E4744F8"/>
+    <w:nsid w:val="00AF7025"/>
     <w:multiLevelType w:val="hybridMultilevel"/>
-    <w:tmpl w:val="4CC69FCA"/>
-    <w:lvl w:ilvl="0" w:tplc="6E7ADE78">
-      <w:start w:val="1"/>
-      <w:numFmt w:val="bullet"/>
-      <w:lvlText w:val="•"/>
-      <w:lvlJc w:val="left"/>
-      <w:pPr>
-        <w:ind w:left="540" w:hanging="300"/>
-      </w:pPr>
-    </w:lvl>
-    <w:lvl w:ilvl="1" w:tplc="460244E6">
-      <w:numFmt w:val="decimal"/>
-      <w:lvlText w:val=""/>
-      <w:lvlJc w:val="left"/>
-    </w:lvl>
-    <w:lvl w:ilvl="2" w:tplc="81BA28D0">
-      <w:numFmt w:val="decimal"/>
-      <w:lvlText w:val=""/>
-      <w:lvlJc w:val="left"/>
-    </w:lvl>
-    <w:lvl w:ilvl="3" w:tplc="3AEA8A04">
-      <w:numFmt w:val="decimal"/>
-      <w:lvlText w:val=""/>
-      <w:lvlJc w:val="left"/>
-    </w:lvl>
-    <w:lvl w:ilvl="4" w:tplc="2DE2824C">
-      <w:numFmt w:val="decimal"/>
-      <w:lvlText w:val=""/>
-      <w:lvlJc w:val="left"/>
-    </w:lvl>
-    <w:lvl w:ilvl="5" w:tplc="3D6238C4">
-      <w:numFmt w:val="decimal"/>
-      <w:lvlText w:val=""/>
-      <w:lvlJc w:val="left"/>
-    </w:lvl>
-    <w:lvl w:ilvl="6" w:tplc="386843B0">
-      <w:numFmt w:val="decimal"/>
-      <w:lvlText w:val=""/>
-      <w:lvlJc w:val="left"/>
-    </w:lvl>
-    <w:lvl w:ilvl="7" w:tplc="28D4BBF4">
-      <w:numFmt w:val="decimal"/>
-      <w:lvlText w:val=""/>
-      <w:lvlJc w:val="left"/>
-    </w:lvl>
-    <w:lvl w:ilvl="8" w:tplc="FC18B422">
-      <w:numFmt w:val="decimal"/>
-      <w:lvlText w:val=""/>
-      <w:lvlJc w:val="left"/>
-    </w:lvl>
-  </w:abstractNum>
-  <w:abstractNum w:abstractNumId="1" w15:restartNumberingAfterBreak="0">
-    <w:nsid w:val="7E5B3305"/>
-    <w:multiLevelType w:val="hybridMultilevel"/>
-    <w:tmpl w:val="AEC42056"/>
-    <w:lvl w:ilvl="0" w:tplc="FAE6CEAC" w:tentative="1">
+    <w:tmpl w:val="AFA276CC"/>
+    <w:lvl w:ilvl="0" w:tplc="D6066334" w:tentative="1">
       <w:start w:val="1"/>
       <w:numFmt w:val="bullet"/>
       <w:lvlText w:val="●"/>
@@ -30118,7 +30174,7 @@
         <w:ind w:left="720" w:hanging="360"/>
       </w:pPr>
     </w:lvl>
-    <w:lvl w:ilvl="1" w:tplc="597ECBB8" w:tentative="1">
+    <w:lvl w:ilvl="1" w:tplc="5CFA42EC" w:tentative="1">
       <w:start w:val="1"/>
       <w:numFmt w:val="bullet"/>
       <w:lvlText w:val="○"/>
@@ -30127,7 +30183,7 @@
         <w:ind w:left="1440" w:hanging="360"/>
       </w:pPr>
     </w:lvl>
-    <w:lvl w:ilvl="2" w:tplc="FA681714" w:tentative="1">
+    <w:lvl w:ilvl="2" w:tplc="D6E81016" w:tentative="1">
       <w:start w:val="1"/>
       <w:numFmt w:val="bullet"/>
       <w:lvlText w:val="■"/>
@@ -30136,7 +30192,7 @@
         <w:ind w:left="2160" w:hanging="360"/>
       </w:pPr>
     </w:lvl>
-    <w:lvl w:ilvl="3" w:tplc="BCCA1DA6" w:tentative="1">
+    <w:lvl w:ilvl="3" w:tplc="84648CAE" w:tentative="1">
       <w:start w:val="1"/>
       <w:numFmt w:val="bullet"/>
       <w:lvlText w:val="●"/>
@@ -30145,7 +30201,7 @@
         <w:ind w:left="2880" w:hanging="360"/>
       </w:pPr>
     </w:lvl>
-    <w:lvl w:ilvl="4" w:tplc="D26E4F80" w:tentative="1">
+    <w:lvl w:ilvl="4" w:tplc="8D3E0BF4" w:tentative="1">
       <w:start w:val="1"/>
       <w:numFmt w:val="bullet"/>
       <w:lvlText w:val="○"/>
@@ -30154,7 +30210,7 @@
         <w:ind w:left="3600" w:hanging="360"/>
       </w:pPr>
     </w:lvl>
-    <w:lvl w:ilvl="5" w:tplc="651E951C" w:tentative="1">
+    <w:lvl w:ilvl="5" w:tplc="F364E688" w:tentative="1">
       <w:start w:val="1"/>
       <w:numFmt w:val="bullet"/>
       <w:lvlText w:val="■"/>
@@ -30163,7 +30219,7 @@
         <w:ind w:left="4320" w:hanging="360"/>
       </w:pPr>
     </w:lvl>
-    <w:lvl w:ilvl="6" w:tplc="C114D722" w:tentative="1">
+    <w:lvl w:ilvl="6" w:tplc="A574EFB2" w:tentative="1">
       <w:start w:val="1"/>
       <w:numFmt w:val="bullet"/>
       <w:lvlText w:val="●"/>
@@ -30172,7 +30228,7 @@
         <w:ind w:left="5040" w:hanging="360"/>
       </w:pPr>
     </w:lvl>
-    <w:lvl w:ilvl="7" w:tplc="BD32AD04" w:tentative="1">
+    <w:lvl w:ilvl="7" w:tplc="36E2D8FE" w:tentative="1">
       <w:start w:val="1"/>
       <w:numFmt w:val="bullet"/>
       <w:lvlText w:val="●"/>
@@ -30181,7 +30237,7 @@
         <w:ind w:left="5760" w:hanging="360"/>
       </w:pPr>
     </w:lvl>
-    <w:lvl w:ilvl="8" w:tplc="EBB2BFBE" w:tentative="1">
+    <w:lvl w:ilvl="8" w:tplc="25440FEC" w:tentative="1">
       <w:start w:val="1"/>
       <w:numFmt w:val="bullet"/>
       <w:lvlText w:val="●"/>
@@ -30191,14 +30247,68 @@
       </w:pPr>
     </w:lvl>
   </w:abstractNum>
-  <w:num w:numId="1" w16cid:durableId="1483277328">
-    <w:abstractNumId w:val="1"/>
+  <w:abstractNum w:abstractNumId="1" w15:restartNumberingAfterBreak="0">
+    <w:nsid w:val="6AD667B9"/>
+    <w:multiLevelType w:val="hybridMultilevel"/>
+    <w:tmpl w:val="F8CAF00E"/>
+    <w:lvl w:ilvl="0" w:tplc="F08AA3B0">
+      <w:start w:val="1"/>
+      <w:numFmt w:val="bullet"/>
+      <w:lvlText w:val="•"/>
+      <w:lvlJc w:val="left"/>
+      <w:pPr>
+        <w:ind w:left="540" w:hanging="300"/>
+      </w:pPr>
+    </w:lvl>
+    <w:lvl w:ilvl="1" w:tplc="139E07D4">
+      <w:numFmt w:val="decimal"/>
+      <w:lvlText w:val=""/>
+      <w:lvlJc w:val="left"/>
+    </w:lvl>
+    <w:lvl w:ilvl="2" w:tplc="B37E7764">
+      <w:numFmt w:val="decimal"/>
+      <w:lvlText w:val=""/>
+      <w:lvlJc w:val="left"/>
+    </w:lvl>
+    <w:lvl w:ilvl="3" w:tplc="AA18E4E8">
+      <w:numFmt w:val="decimal"/>
+      <w:lvlText w:val=""/>
+      <w:lvlJc w:val="left"/>
+    </w:lvl>
+    <w:lvl w:ilvl="4" w:tplc="5DA85C40">
+      <w:numFmt w:val="decimal"/>
+      <w:lvlText w:val=""/>
+      <w:lvlJc w:val="left"/>
+    </w:lvl>
+    <w:lvl w:ilvl="5" w:tplc="73167BA4">
+      <w:numFmt w:val="decimal"/>
+      <w:lvlText w:val=""/>
+      <w:lvlJc w:val="left"/>
+    </w:lvl>
+    <w:lvl w:ilvl="6" w:tplc="B1DAABE0">
+      <w:numFmt w:val="decimal"/>
+      <w:lvlText w:val=""/>
+      <w:lvlJc w:val="left"/>
+    </w:lvl>
+    <w:lvl w:ilvl="7" w:tplc="394436CA">
+      <w:numFmt w:val="decimal"/>
+      <w:lvlText w:val=""/>
+      <w:lvlJc w:val="left"/>
+    </w:lvl>
+    <w:lvl w:ilvl="8" w:tplc="407C6330">
+      <w:numFmt w:val="decimal"/>
+      <w:lvlText w:val=""/>
+      <w:lvlJc w:val="left"/>
+    </w:lvl>
+  </w:abstractNum>
+  <w:num w:numId="1" w16cid:durableId="1817142340">
+    <w:abstractNumId w:val="0"/>
     <w:lvlOverride w:ilvl="0">
       <w:startOverride w:val="1"/>
     </w:lvlOverride>
   </w:num>
-  <w:num w:numId="2" w16cid:durableId="448092548">
-    <w:abstractNumId w:val="0"/>
+  <w:num w:numId="2" w16cid:durableId="1702781651">
+    <w:abstractNumId w:val="1"/>
     <w:lvlOverride w:ilvl="0">
       <w:startOverride w:val="1"/>
     </w:lvlOverride>

</xml_diff>